<commit_message>
Add Weather dashboard card and misc dashboard/tender fixes
Co-Authored-By: Claude Sonnet 5 <noreply@anthropic.com>
</commit_message>
<xml_diff>
--- a/resources/file-backer-template-header2.docx
+++ b/resources/file-backer-template-header2.docx
@@ -1029,7 +1029,7 @@
     </w:p>
     <w:sectPr>
       <w:pgSz w:w="12240" w:h="15840"/>
-      <w:pgMar w:top="1440" w:right="1800" w:bottom="1440" w:left="1800" w:header="720" w:footer="720" w:gutter="0"/>
+      <w:pgMar w:top="936" w:right="1800" w:bottom="1440" w:left="1800" w:header="720" w:footer="720" w:gutter="0"/>
       <w:cols w:space="720"/>
     </w:sectPr>
   </w:body>
@@ -1155,6 +1155,1043 @@
     <w:abstractNumId w:val="0"/>
   </w:num>
 </w:numbering>
+</file>
+
+<file path=word/pretty.xml><?xml version="1.0" encoding="utf-8"?>
+<w:document xmlns:wpc="http://schemas.microsoft.com/office/word/2010/wordprocessingCanvas" xmlns:cx="http://schemas.microsoft.com/office/drawing/2014/chartex" xmlns:cx1="http://schemas.microsoft.com/office/drawing/2015/9/8/chartex" xmlns:cx2="http://schemas.microsoft.com/office/drawing/2015/10/21/chartex" xmlns:cx3="http://schemas.microsoft.com/office/drawing/2016/5/9/chartex" xmlns:cx4="http://schemas.microsoft.com/office/drawing/2016/5/10/chartex" xmlns:cx5="http://schemas.microsoft.com/office/drawing/2016/5/11/chartex" xmlns:cx6="http://schemas.microsoft.com/office/drawing/2016/5/12/chartex" xmlns:cx7="http://schemas.microsoft.com/office/drawing/2016/5/13/chartex" xmlns:cx8="http://schemas.microsoft.com/office/drawing/2016/5/14/chartex" xmlns:mc="http://schemas.openxmlformats.org/markup-compatibility/2006" xmlns:aink="http://schemas.microsoft.com/office/drawing/2016/ink" xmlns:am3d="http://schemas.microsoft.com/office/drawing/2017/model3d" xmlns:o="urn:schemas-microsoft-com:office:office" xmlns:oel="http://schemas.microsoft.com/office/2019/extlst" xmlns:r="http://schemas.openxmlformats.org/officeDocument/2006/relationships" xmlns:m="http://schemas.openxmlformats.org/officeDocument/2006/math" xmlns:v="urn:schemas-microsoft-com:vml" xmlns:wp14="http://schemas.microsoft.com/office/word/2010/wordprocessingDrawing" xmlns:wp="http://schemas.openxmlformats.org/drawingml/2006/wordprocessingDrawing" xmlns:w10="urn:schemas-microsoft-com:office:word" xmlns:w="http://schemas.openxmlformats.org/wordprocessingml/2006/main" xmlns:w14="http://schemas.microsoft.com/office/word/2010/wordml" xmlns:w15="http://schemas.microsoft.com/office/word/2012/wordml" xmlns:w16cex="http://schemas.microsoft.com/office/word/2018/wordml/cex" xmlns:w16cid="http://schemas.microsoft.com/office/word/2016/wordml/cid" xmlns:w16="http://schemas.microsoft.com/office/word/2018/wordml" xmlns:w16du="http://schemas.microsoft.com/office/word/2023/wordml/word16du" xmlns:w16sdtdh="http://schemas.microsoft.com/office/word/2020/wordml/sdtdatahash" xmlns:w16sdtfl="http://schemas.microsoft.com/office/word/2024/wordml/sdtformatlock" xmlns:w16se="http://schemas.microsoft.com/office/word/2015/wordml/symex" xmlns:wpg="http://schemas.microsoft.com/office/word/2010/wordprocessingGroup" xmlns:wpi="http://schemas.microsoft.com/office/word/2010/wordprocessingInk" xmlns:wne="http://schemas.microsoft.com/office/word/2006/wordml" xmlns:wps="http://schemas.microsoft.com/office/word/2010/wordprocessingShape" mc:Ignorable="w14 w15 w16se w16cid w16 w16cex w16sdtdh w16sdtfl w16du wp14">
+  <w:body>
+    <w:p>
+      <w:pPr>
+        <w:pStyle w:val="ListParagraph"/>
+        <w:ind w:left="-709" w:right="-999"/>
+        <w:rPr>
+          <w:rStyle w:val="IntenseReference"/>
+          <w:sz w:val="48"/>
+          <w:szCs w:val="48"/>
+        </w:rPr>
+      </w:pPr>
+      <w:r>
+        <w:t xml:space="preserve"> </w:t>
+      </w:r>
+    </w:p>
+    <w:tbl>
+      <w:tblPr>
+        <w:tblW w:w="10972" w:type="dxa"/>
+        <w:tblInd w:w="-969" w:type="dxa"/>
+        <w:tblLayout w:type="fixed"/>
+        <w:tblLook w:val="04A0" w:firstRow="1" w:lastRow="0" w:firstColumn="1" w:lastColumn="0" w:noHBand="0" w:noVBand="1"/>
+      </w:tblPr>
+      <w:tblGrid>
+        <w:gridCol w:w="2599"/>
+        <w:gridCol w:w="6629"/>
+        <w:gridCol w:w="1744"/>
+      </w:tblGrid>
+      <w:tr>
+        <w:trPr>
+          <w:trHeight w:val="1185"/>
+        </w:trPr>
+        <w:tc>
+          <w:tcPr>
+            <w:tcW w:w="2599" w:type="dxa"/>
+            <w:tcMar>
+              <w:top w:w="0" w:type="dxa"/>
+              <w:left w:w="0" w:type="dxa"/>
+              <w:bottom w:w="0" w:type="dxa"/>
+              <w:right w:w="144" w:type="dxa"/>
+            </w:tcMar>
+            <w:vAlign w:val="center"/>
+          </w:tcPr>
+          <w:p>
+            <w:pPr>
+              <w:jc w:val="right"/>
+            </w:pPr>
+            <w:r>
+              <w:rPr>
+                <w:noProof/>
+              </w:rPr>
+              <w:drawing>
+                <wp:inline distT="0" distB="0" distL="0" distR="0" wp14:anchorId="1F7324B0" wp14:editId="1F532BFC">
+                  <wp:extent cx="1354124" cy="682906"/>
+                  <wp:effectExtent l="0" t="0" r="5080" b="3175"/>
+                  <wp:docPr id="1" name="Picture 1"/>
+                  <wp:cNvGraphicFramePr>
+                    <a:graphicFrameLocks xmlns:a="http://schemas.openxmlformats.org/drawingml/2006/main" noChangeAspect="1"/>
+                  </wp:cNvGraphicFramePr>
+                  <a:graphic xmlns:a="http://schemas.openxmlformats.org/drawingml/2006/main">
+                    <a:graphicData uri="http://schemas.openxmlformats.org/drawingml/2006/picture">
+                      <pic:pic xmlns:pic="http://schemas.openxmlformats.org/drawingml/2006/picture">
+                        <pic:nvPicPr>
+                          <pic:cNvPr id="0" name="telanganalogo.png"/>
+                          <pic:cNvPicPr/>
+                        </pic:nvPicPr>
+                        <pic:blipFill>
+                          <a:blip r:embed="rId7"/>
+                          <a:stretch>
+                            <a:fillRect/>
+                          </a:stretch>
+                        </pic:blipFill>
+                        <pic:spPr>
+                          <a:xfrm>
+                            <a:off x="0" y="0"/>
+                            <a:ext cx="1372916" cy="692383"/>
+                          </a:xfrm>
+                          <a:prstGeom prst="rect">
+                            <a:avLst/>
+                          </a:prstGeom>
+                        </pic:spPr>
+                      </pic:pic>
+                    </a:graphicData>
+                  </a:graphic>
+                </wp:inline>
+              </w:drawing>
+            </w:r>
+          </w:p>
+        </w:tc>
+        <w:tc>
+          <w:tcPr>
+            <w:tcW w:w="6629" w:type="dxa"/>
+            <w:tcMar>
+              <w:top w:w="0" w:type="dxa"/>
+              <w:left w:w="0" w:type="dxa"/>
+              <w:bottom w:w="0" w:type="dxa"/>
+              <w:right w:w="0" w:type="dxa"/>
+            </w:tcMar>
+            <w:vAlign w:val="center"/>
+          </w:tcPr>
+          <w:p>
+            <w:pPr>
+              <w:jc w:val="center"/>
+              <w:rPr>
+                <w:sz w:val="32"/>
+                <w:szCs w:val="28"/>
+              </w:rPr>
+            </w:pPr>
+            <w:r>
+              <w:rPr>
+                <w:rFonts w:ascii="Calibri" w:hAnsi="Calibri" w:cs="Calibri"/>
+                <w:b/>
+                <w:color w:val="0E3A86"/>
+                <w:sz w:val="40"/>
+                <w:szCs w:val="36"/>
+              </w:rPr>
+              <w:t>CYBERABAD MUNICIPAL CORPORATION</w:t>
+            </w:r>
+            <w:r>
+              <w:rPr>
+                <w:sz w:val="40"/>
+                <w:szCs w:val="36"/>
+              </w:rPr>
+              <w:br/>
+            </w:r>
+            <w:r>
+              <w:rPr>
+                <w:rFonts w:cs="Gautami"/>
+                <w:color w:val="009EC6"/>
+                <w:sz w:val="48"/>
+                <w:szCs w:val="44"/>
+              </w:rPr>
+              <w:t xml:space="preserve">సైబరాబాద్ మున్సిపల్ కార్పొరేషన్</w:t>
+            </w:r>
+          </w:p>
+        </w:tc>
+        <w:tc>
+          <w:tcPr>
+            <w:tcW w:w="1744" w:type="dxa"/>
+            <w:tcMar>
+              <w:top w:w="0" w:type="dxa"/>
+              <w:left w:w="144" w:type="dxa"/>
+              <w:bottom w:w="0" w:type="dxa"/>
+              <w:right w:w="0" w:type="dxa"/>
+            </w:tcMar>
+            <w:vAlign w:val="center"/>
+          </w:tcPr>
+          <w:p>
+            <w:r>
+              <w:rPr>
+                <w:noProof/>
+              </w:rPr>
+              <w:drawing>
+                <wp:inline distT="0" distB="0" distL="0" distR="0" wp14:anchorId="54CB374A" wp14:editId="1314FC6F">
+                  <wp:extent cx="988505" cy="717349"/>
+                  <wp:effectExtent l="0" t="0" r="2540" b="0"/>
+                  <wp:docPr id="2" name="Picture 2"/>
+                  <wp:cNvGraphicFramePr>
+                    <a:graphicFrameLocks xmlns:a="http://schemas.openxmlformats.org/drawingml/2006/main" noChangeAspect="1"/>
+                  </wp:cNvGraphicFramePr>
+                  <a:graphic xmlns:a="http://schemas.openxmlformats.org/drawingml/2006/main">
+                    <a:graphicData uri="http://schemas.openxmlformats.org/drawingml/2006/picture">
+                      <pic:pic xmlns:pic="http://schemas.openxmlformats.org/drawingml/2006/picture">
+                        <pic:nvPicPr>
+                          <pic:cNvPr id="0" name="CMCNewLogo.png"/>
+                          <pic:cNvPicPr/>
+                        </pic:nvPicPr>
+                        <pic:blipFill>
+                          <a:blip r:embed="rId8"/>
+                          <a:stretch>
+                            <a:fillRect/>
+                          </a:stretch>
+                        </pic:blipFill>
+                        <pic:spPr>
+                          <a:xfrm>
+                            <a:off x="0" y="0"/>
+                            <a:ext cx="1011498" cy="734035"/>
+                          </a:xfrm>
+                          <a:prstGeom prst="rect">
+                            <a:avLst/>
+                          </a:prstGeom>
+                        </pic:spPr>
+                      </pic:pic>
+                    </a:graphicData>
+                  </a:graphic>
+                </wp:inline>
+              </w:drawing>
+            </w:r>
+          </w:p>
+        </w:tc>
+      </w:tr>
+    </w:tbl>
+    <w:p>
+      <w:pPr>
+        <w:jc w:val="center"/>
+        <w:rPr>
+          <w:b/>
+          <w:sz w:val="40"/>
+          <w:szCs w:val="36"/>
+        </w:rPr>
+      </w:pPr>
+    </w:p>
+    <w:p>
+      <w:pPr>
+        <w:jc w:val="center"/>
+        <w:rPr>
+          <w:b/>
+          <w:sz w:val="40"/>
+          <w:szCs w:val="36"/>
+        </w:rPr>
+      </w:pPr>
+      <w:r>
+        <w:rPr>
+          <w:b/>
+          <w:sz w:val="40"/>
+          <w:szCs w:val="36"/>
+        </w:rPr>
+        <w:t>{{Circle Header}}</w:t>
+      </w:r>
+    </w:p>
+    <w:p>
+      <w:pPr>
+        <w:jc w:val="center"/>
+        <w:rPr>
+          <w:sz w:val="36"/>
+          <w:szCs w:val="36"/>
+        </w:rPr>
+      </w:pPr>
+    </w:p>
+    <w:tbl>
+      <w:tblPr>
+        <w:tblW w:w="9630" w:type="dxa"/>
+        <w:jc w:val="center"/>
+        <w:tblCellSpacing w:w="0" w:type="dxa"/>
+        <w:tblBorders>
+          <w:top w:val="single" w:sz="8" w:space="0" w:color="000000"/>
+          <w:left w:val="single" w:sz="8" w:space="0" w:color="000000"/>
+          <w:bottom w:val="single" w:sz="8" w:space="0" w:color="000000"/>
+          <w:right w:val="single" w:sz="8" w:space="0" w:color="000000"/>
+          <w:insideH w:val="single" w:sz="8" w:space="0" w:color="000000"/>
+          <w:insideV w:val="single" w:sz="8" w:space="0" w:color="000000"/>
+        </w:tblBorders>
+        <w:tblCellMar>
+          <w:top w:w="80" w:type="dxa"/>
+          <w:left w:w="160" w:type="dxa"/>
+          <w:bottom w:w="80" w:type="dxa"/>
+          <w:right w:w="160" w:type="dxa"/>
+        </w:tblCellMar>
+        <w:tblLook w:val="04A0" w:firstRow="1" w:lastRow="0" w:firstColumn="1" w:lastColumn="0" w:noHBand="0" w:noVBand="1"/>
+      </w:tblPr>
+      <w:tblGrid>
+        <w:gridCol w:w="3344"/>
+        <w:gridCol w:w="469"/>
+        <w:gridCol w:w="5817"/>
+      </w:tblGrid>
+      <w:tr>
+        <w:trPr>
+          <w:cantSplit/>
+          <w:trHeight w:val="812"/>
+          <w:tblCellSpacing w:w="0" w:type="dxa"/>
+          <w:jc w:val="center"/>
+        </w:trPr>
+        <w:tc>
+          <w:tcPr>
+            <w:tcW w:w="3344" w:type="dxa"/>
+            <w:tcBorders>
+              <w:top w:val="single" w:sz="8" w:space="0" w:color="000000"/>
+              <w:left w:val="single" w:sz="8" w:space="0" w:color="000000"/>
+              <w:bottom w:val="single" w:sz="8" w:space="0" w:color="000000"/>
+              <w:right w:val="single" w:sz="8" w:space="0" w:color="000000"/>
+            </w:tcBorders>
+            <w:vAlign w:val="center"/>
+          </w:tcPr>
+          <w:p>
+            <w:pPr>
+              <w:jc w:val="center"/>
+              <w:rPr>
+                <w:sz w:val="24"/>
+                <w:szCs w:val="24"/>
+              </w:rPr>
+            </w:pPr>
+            <w:r>
+              <w:rPr>
+                <w:b/>
+                <w:sz w:val="24"/>
+                <w:szCs w:val="24"/>
+              </w:rPr>
+              <w:t>Tender ID</w:t>
+            </w:r>
+          </w:p>
+        </w:tc>
+        <w:tc>
+          <w:tcPr>
+            <w:tcW w:w="469" w:type="dxa"/>
+            <w:tcBorders>
+              <w:top w:val="single" w:sz="8" w:space="0" w:color="000000"/>
+              <w:left w:val="single" w:sz="8" w:space="0" w:color="000000"/>
+              <w:bottom w:val="single" w:sz="8" w:space="0" w:color="000000"/>
+              <w:right w:val="single" w:sz="8" w:space="0" w:color="000000"/>
+            </w:tcBorders>
+            <w:vAlign w:val="center"/>
+          </w:tcPr>
+          <w:p>
+            <w:pPr>
+              <w:jc w:val="center"/>
+            </w:pPr>
+            <w:r>
+              <w:t>:</w:t>
+            </w:r>
+          </w:p>
+        </w:tc>
+        <w:tc>
+          <w:tcPr>
+            <w:tcW w:w="0" w:type="auto"/>
+            <w:tcBorders>
+              <w:top w:val="single" w:sz="8" w:space="0" w:color="000000"/>
+              <w:left w:val="single" w:sz="8" w:space="0" w:color="000000"/>
+              <w:bottom w:val="single" w:sz="8" w:space="0" w:color="000000"/>
+              <w:right w:val="single" w:sz="8" w:space="0" w:color="000000"/>
+            </w:tcBorders>
+            <w:vAlign w:val="center"/>
+          </w:tcPr>
+          <w:p>
+            <w:pPr>
+              <w:jc w:val="both"/>
+              <w:rPr>
+                <w:sz w:val="24"/>
+                <w:szCs w:val="24"/>
+              </w:rPr>
+            </w:pPr>
+            <w:r>
+              <w:rPr>
+                <w:sz w:val="24"/>
+                <w:szCs w:val="24"/>
+              </w:rPr>
+              <w:t xml:space="preserve">{{Tender ID}}</w:t>
+            </w:r>
+          </w:p>
+        </w:tc>
+      </w:tr>
+      <w:tr>
+        <w:trPr>
+          <w:cantSplit/>
+          <w:trHeight w:val="812"/>
+          <w:tblCellSpacing w:w="0" w:type="dxa"/>
+          <w:jc w:val="center"/>
+        </w:trPr>
+        <w:tc>
+          <w:tcPr>
+            <w:tcW w:w="3344" w:type="dxa"/>
+            <w:tcBorders>
+              <w:top w:val="single" w:sz="8" w:space="0" w:color="000000"/>
+              <w:left w:val="single" w:sz="8" w:space="0" w:color="000000"/>
+              <w:bottom w:val="single" w:sz="8" w:space="0" w:color="000000"/>
+              <w:right w:val="single" w:sz="8" w:space="0" w:color="000000"/>
+            </w:tcBorders>
+            <w:vAlign w:val="center"/>
+          </w:tcPr>
+          <w:p>
+            <w:pPr>
+              <w:jc w:val="center"/>
+              <w:rPr>
+                <w:sz w:val="24"/>
+                <w:szCs w:val="24"/>
+              </w:rPr>
+            </w:pPr>
+            <w:r>
+              <w:rPr>
+                <w:b/>
+                <w:sz w:val="24"/>
+                <w:szCs w:val="24"/>
+              </w:rPr>
+              <w:t>NIT No &amp; Date</w:t>
+            </w:r>
+          </w:p>
+        </w:tc>
+        <w:tc>
+          <w:tcPr>
+            <w:tcW w:w="469" w:type="dxa"/>
+            <w:tcBorders>
+              <w:top w:val="single" w:sz="8" w:space="0" w:color="000000"/>
+              <w:left w:val="single" w:sz="8" w:space="0" w:color="000000"/>
+              <w:bottom w:val="single" w:sz="8" w:space="0" w:color="000000"/>
+              <w:right w:val="single" w:sz="8" w:space="0" w:color="000000"/>
+            </w:tcBorders>
+            <w:vAlign w:val="center"/>
+          </w:tcPr>
+          <w:p>
+            <w:pPr>
+              <w:jc w:val="center"/>
+            </w:pPr>
+            <w:r>
+              <w:t>:</w:t>
+            </w:r>
+          </w:p>
+        </w:tc>
+        <w:tc>
+          <w:tcPr>
+            <w:tcW w:w="0" w:type="auto"/>
+            <w:tcBorders>
+              <w:top w:val="single" w:sz="8" w:space="0" w:color="000000"/>
+              <w:left w:val="single" w:sz="8" w:space="0" w:color="000000"/>
+              <w:bottom w:val="single" w:sz="8" w:space="0" w:color="000000"/>
+              <w:right w:val="single" w:sz="8" w:space="0" w:color="000000"/>
+            </w:tcBorders>
+            <w:vAlign w:val="center"/>
+          </w:tcPr>
+          <w:p>
+            <w:pPr>
+              <w:jc w:val="both"/>
+              <w:rPr>
+                <w:sz w:val="24"/>
+                <w:szCs w:val="24"/>
+              </w:rPr>
+            </w:pPr>
+            <w:r>
+              <w:rPr>
+                <w:sz w:val="24"/>
+                <w:szCs w:val="24"/>
+              </w:rPr>
+              <w:t xml:space="preserve">{{NIT No}}, Dt. {{NIT Date}}</w:t>
+            </w:r>
+          </w:p>
+        </w:tc>
+      </w:tr>
+      <w:tr>
+        <w:trPr>
+          <w:cantSplit/>
+          <w:trHeight w:val="812"/>
+          <w:tblCellSpacing w:w="0" w:type="dxa"/>
+          <w:jc w:val="center"/>
+        </w:trPr>
+        <w:tc>
+          <w:tcPr>
+            <w:tcW w:w="3344" w:type="dxa"/>
+            <w:tcBorders>
+              <w:top w:val="single" w:sz="8" w:space="0" w:color="000000"/>
+              <w:left w:val="single" w:sz="8" w:space="0" w:color="000000"/>
+              <w:bottom w:val="single" w:sz="8" w:space="0" w:color="000000"/>
+              <w:right w:val="single" w:sz="8" w:space="0" w:color="000000"/>
+            </w:tcBorders>
+            <w:vAlign w:val="center"/>
+          </w:tcPr>
+          <w:p>
+            <w:pPr>
+              <w:jc w:val="center"/>
+              <w:rPr>
+                <w:sz w:val="24"/>
+                <w:szCs w:val="24"/>
+              </w:rPr>
+            </w:pPr>
+            <w:r>
+              <w:rPr>
+                <w:b/>
+                <w:sz w:val="24"/>
+                <w:szCs w:val="24"/>
+              </w:rPr>
+              <w:t>Name of the Work</w:t>
+            </w:r>
+          </w:p>
+        </w:tc>
+        <w:tc>
+          <w:tcPr>
+            <w:tcW w:w="469" w:type="dxa"/>
+            <w:tcBorders>
+              <w:top w:val="single" w:sz="8" w:space="0" w:color="000000"/>
+              <w:left w:val="single" w:sz="8" w:space="0" w:color="000000"/>
+              <w:bottom w:val="single" w:sz="8" w:space="0" w:color="000000"/>
+              <w:right w:val="single" w:sz="8" w:space="0" w:color="000000"/>
+            </w:tcBorders>
+            <w:vAlign w:val="center"/>
+          </w:tcPr>
+          <w:p>
+            <w:pPr>
+              <w:jc w:val="center"/>
+            </w:pPr>
+            <w:r>
+              <w:t>:</w:t>
+            </w:r>
+          </w:p>
+        </w:tc>
+        <w:tc>
+          <w:tcPr>
+            <w:tcW w:w="0" w:type="auto"/>
+            <w:tcBorders>
+              <w:top w:val="single" w:sz="8" w:space="0" w:color="000000"/>
+              <w:left w:val="single" w:sz="8" w:space="0" w:color="000000"/>
+              <w:bottom w:val="single" w:sz="8" w:space="0" w:color="000000"/>
+              <w:right w:val="single" w:sz="8" w:space="0" w:color="000000"/>
+            </w:tcBorders>
+            <w:vAlign w:val="center"/>
+          </w:tcPr>
+          <w:p>
+            <w:pPr>
+              <w:jc w:val="both"/>
+              <w:rPr>
+                <w:sz w:val="24"/>
+                <w:szCs w:val="24"/>
+              </w:rPr>
+            </w:pPr>
+            <w:r>
+              <w:rPr>
+                <w:sz w:val="24"/>
+                <w:szCs w:val="24"/>
+              </w:rPr>
+              <w:t xml:space="preserve">{{Name of the work}}</w:t>
+            </w:r>
+          </w:p>
+        </w:tc>
+      </w:tr>
+      <w:tr>
+        <w:trPr>
+          <w:cantSplit/>
+          <w:trHeight w:val="812"/>
+          <w:tblCellSpacing w:w="0" w:type="dxa"/>
+          <w:jc w:val="center"/>
+        </w:trPr>
+        <w:tc>
+          <w:tcPr>
+            <w:tcW w:w="3344" w:type="dxa"/>
+            <w:tcBorders>
+              <w:top w:val="single" w:sz="8" w:space="0" w:color="000000"/>
+              <w:left w:val="single" w:sz="8" w:space="0" w:color="000000"/>
+              <w:bottom w:val="single" w:sz="8" w:space="0" w:color="000000"/>
+              <w:right w:val="single" w:sz="8" w:space="0" w:color="000000"/>
+            </w:tcBorders>
+            <w:vAlign w:val="center"/>
+          </w:tcPr>
+          <w:p>
+            <w:pPr>
+              <w:jc w:val="center"/>
+              <w:rPr>
+                <w:sz w:val="24"/>
+                <w:szCs w:val="24"/>
+              </w:rPr>
+            </w:pPr>
+            <w:r>
+              <w:rPr>
+                <w:b/>
+                <w:sz w:val="24"/>
+                <w:szCs w:val="24"/>
+              </w:rPr>
+              <w:t>Estimate Amount</w:t>
+            </w:r>
+          </w:p>
+        </w:tc>
+        <w:tc>
+          <w:tcPr>
+            <w:tcW w:w="469" w:type="dxa"/>
+            <w:tcBorders>
+              <w:top w:val="single" w:sz="8" w:space="0" w:color="000000"/>
+              <w:left w:val="single" w:sz="8" w:space="0" w:color="000000"/>
+              <w:bottom w:val="single" w:sz="8" w:space="0" w:color="000000"/>
+              <w:right w:val="single" w:sz="8" w:space="0" w:color="000000"/>
+            </w:tcBorders>
+            <w:vAlign w:val="center"/>
+          </w:tcPr>
+          <w:p>
+            <w:pPr>
+              <w:jc w:val="center"/>
+            </w:pPr>
+            <w:r>
+              <w:t>:</w:t>
+            </w:r>
+          </w:p>
+        </w:tc>
+        <w:tc>
+          <w:tcPr>
+            <w:tcW w:w="0" w:type="auto"/>
+            <w:tcBorders>
+              <w:top w:val="single" w:sz="8" w:space="0" w:color="000000"/>
+              <w:left w:val="single" w:sz="8" w:space="0" w:color="000000"/>
+              <w:bottom w:val="single" w:sz="8" w:space="0" w:color="000000"/>
+              <w:right w:val="single" w:sz="8" w:space="0" w:color="000000"/>
+            </w:tcBorders>
+            <w:vAlign w:val="center"/>
+          </w:tcPr>
+          <w:p>
+            <w:pPr>
+              <w:jc w:val="both"/>
+              <w:rPr>
+                <w:sz w:val="24"/>
+                <w:szCs w:val="24"/>
+              </w:rPr>
+            </w:pPr>
+            <w:r>
+              <w:rPr>
+                <w:sz w:val="24"/>
+                <w:szCs w:val="24"/>
+              </w:rPr>
+              <w:t xml:space="preserve">{{Estimate Amount}}</w:t>
+            </w:r>
+          </w:p>
+        </w:tc>
+      </w:tr>
+      <w:tr>
+        <w:trPr>
+          <w:cantSplit/>
+          <w:trHeight w:val="812"/>
+          <w:tblCellSpacing w:w="0" w:type="dxa"/>
+          <w:jc w:val="center"/>
+        </w:trPr>
+        <w:tc>
+          <w:tcPr>
+            <w:tcW w:w="3344" w:type="dxa"/>
+            <w:tcBorders>
+              <w:top w:val="single" w:sz="8" w:space="0" w:color="000000"/>
+              <w:left w:val="single" w:sz="8" w:space="0" w:color="000000"/>
+              <w:bottom w:val="single" w:sz="8" w:space="0" w:color="000000"/>
+              <w:right w:val="single" w:sz="8" w:space="0" w:color="000000"/>
+            </w:tcBorders>
+            <w:vAlign w:val="center"/>
+          </w:tcPr>
+          <w:p>
+            <w:pPr>
+              <w:jc w:val="center"/>
+              <w:rPr>
+                <w:sz w:val="24"/>
+                <w:szCs w:val="24"/>
+              </w:rPr>
+            </w:pPr>
+            <w:r>
+              <w:rPr>
+                <w:b/>
+                <w:sz w:val="24"/>
+                <w:szCs w:val="24"/>
+              </w:rPr>
+              <w:t>ECV</w:t>
+            </w:r>
+          </w:p>
+        </w:tc>
+        <w:tc>
+          <w:tcPr>
+            <w:tcW w:w="469" w:type="dxa"/>
+            <w:tcBorders>
+              <w:top w:val="single" w:sz="8" w:space="0" w:color="000000"/>
+              <w:left w:val="single" w:sz="8" w:space="0" w:color="000000"/>
+              <w:bottom w:val="single" w:sz="8" w:space="0" w:color="000000"/>
+              <w:right w:val="single" w:sz="8" w:space="0" w:color="000000"/>
+            </w:tcBorders>
+            <w:vAlign w:val="center"/>
+          </w:tcPr>
+          <w:p>
+            <w:pPr>
+              <w:jc w:val="center"/>
+            </w:pPr>
+            <w:r>
+              <w:t>:</w:t>
+            </w:r>
+          </w:p>
+        </w:tc>
+        <w:tc>
+          <w:tcPr>
+            <w:tcW w:w="0" w:type="auto"/>
+            <w:tcBorders>
+              <w:top w:val="single" w:sz="8" w:space="0" w:color="000000"/>
+              <w:left w:val="single" w:sz="8" w:space="0" w:color="000000"/>
+              <w:bottom w:val="single" w:sz="8" w:space="0" w:color="000000"/>
+              <w:right w:val="single" w:sz="8" w:space="0" w:color="000000"/>
+            </w:tcBorders>
+            <w:vAlign w:val="center"/>
+          </w:tcPr>
+          <w:p>
+            <w:pPr>
+              <w:jc w:val="both"/>
+              <w:rPr>
+                <w:sz w:val="24"/>
+                <w:szCs w:val="24"/>
+              </w:rPr>
+            </w:pPr>
+            <w:r>
+              <w:rPr>
+                <w:sz w:val="24"/>
+                <w:szCs w:val="24"/>
+              </w:rPr>
+              <w:t xml:space="preserve">{{ECV}}</w:t>
+            </w:r>
+          </w:p>
+        </w:tc>
+      </w:tr>
+      <w:tr>
+        <w:trPr>
+          <w:cantSplit/>
+          <w:trHeight w:val="812"/>
+          <w:tblCellSpacing w:w="0" w:type="dxa"/>
+          <w:jc w:val="center"/>
+        </w:trPr>
+        <w:tc>
+          <w:tcPr>
+            <w:tcW w:w="3344" w:type="dxa"/>
+            <w:tcBorders>
+              <w:top w:val="single" w:sz="8" w:space="0" w:color="000000"/>
+              <w:left w:val="single" w:sz="8" w:space="0" w:color="000000"/>
+              <w:bottom w:val="single" w:sz="8" w:space="0" w:color="000000"/>
+              <w:right w:val="single" w:sz="8" w:space="0" w:color="000000"/>
+            </w:tcBorders>
+            <w:vAlign w:val="center"/>
+          </w:tcPr>
+          <w:p>
+            <w:pPr>
+              <w:jc w:val="center"/>
+              <w:rPr>
+                <w:sz w:val="24"/>
+                <w:szCs w:val="24"/>
+              </w:rPr>
+            </w:pPr>
+            <w:r>
+              <w:rPr>
+                <w:b/>
+                <w:sz w:val="24"/>
+                <w:szCs w:val="24"/>
+              </w:rPr>
+              <w:t>Contract Amount</w:t>
+            </w:r>
+          </w:p>
+        </w:tc>
+        <w:tc>
+          <w:tcPr>
+            <w:tcW w:w="469" w:type="dxa"/>
+            <w:tcBorders>
+              <w:top w:val="single" w:sz="8" w:space="0" w:color="000000"/>
+              <w:left w:val="single" w:sz="8" w:space="0" w:color="000000"/>
+              <w:bottom w:val="single" w:sz="8" w:space="0" w:color="000000"/>
+              <w:right w:val="single" w:sz="8" w:space="0" w:color="000000"/>
+            </w:tcBorders>
+            <w:vAlign w:val="center"/>
+          </w:tcPr>
+          <w:p>
+            <w:pPr>
+              <w:jc w:val="center"/>
+            </w:pPr>
+            <w:r>
+              <w:t>:</w:t>
+            </w:r>
+          </w:p>
+        </w:tc>
+        <w:tc>
+          <w:tcPr>
+            <w:tcW w:w="0" w:type="auto"/>
+            <w:tcBorders>
+              <w:top w:val="single" w:sz="8" w:space="0" w:color="000000"/>
+              <w:left w:val="single" w:sz="8" w:space="0" w:color="000000"/>
+              <w:bottom w:val="single" w:sz="8" w:space="0" w:color="000000"/>
+              <w:right w:val="single" w:sz="8" w:space="0" w:color="000000"/>
+            </w:tcBorders>
+            <w:vAlign w:val="center"/>
+          </w:tcPr>
+          <w:p>
+            <w:pPr>
+              <w:jc w:val="both"/>
+              <w:rPr>
+                <w:sz w:val="24"/>
+                <w:szCs w:val="24"/>
+              </w:rPr>
+            </w:pPr>
+            <w:r>
+              <w:rPr>
+                <w:sz w:val="24"/>
+                <w:szCs w:val="24"/>
+              </w:rPr>
+              <w:t xml:space="preserve">{{Contract Amount}}</w:t>
+            </w:r>
+          </w:p>
+        </w:tc>
+      </w:tr>
+      <w:tr>
+        <w:trPr>
+          <w:cantSplit/>
+          <w:trHeight w:val="812"/>
+          <w:tblCellSpacing w:w="0" w:type="dxa"/>
+          <w:jc w:val="center"/>
+        </w:trPr>
+        <w:tc>
+          <w:tcPr>
+            <w:tcW w:w="3344" w:type="dxa"/>
+            <w:tcBorders>
+              <w:top w:val="single" w:sz="8" w:space="0" w:color="000000"/>
+              <w:left w:val="single" w:sz="8" w:space="0" w:color="000000"/>
+              <w:bottom w:val="single" w:sz="8" w:space="0" w:color="000000"/>
+              <w:right w:val="single" w:sz="8" w:space="0" w:color="000000"/>
+            </w:tcBorders>
+            <w:vAlign w:val="center"/>
+          </w:tcPr>
+          <w:p>
+            <w:pPr>
+              <w:jc w:val="center"/>
+              <w:rPr>
+                <w:sz w:val="24"/>
+                <w:szCs w:val="24"/>
+              </w:rPr>
+            </w:pPr>
+            <w:r>
+              <w:rPr>
+                <w:b/>
+                <w:sz w:val="24"/>
+                <w:szCs w:val="24"/>
+              </w:rPr>
+              <w:t>Tender Percentage</w:t>
+            </w:r>
+          </w:p>
+        </w:tc>
+        <w:tc>
+          <w:tcPr>
+            <w:tcW w:w="469" w:type="dxa"/>
+            <w:tcBorders>
+              <w:top w:val="single" w:sz="8" w:space="0" w:color="000000"/>
+              <w:left w:val="single" w:sz="8" w:space="0" w:color="000000"/>
+              <w:bottom w:val="single" w:sz="8" w:space="0" w:color="000000"/>
+              <w:right w:val="single" w:sz="8" w:space="0" w:color="000000"/>
+            </w:tcBorders>
+            <w:vAlign w:val="center"/>
+          </w:tcPr>
+          <w:p>
+            <w:pPr>
+              <w:jc w:val="center"/>
+            </w:pPr>
+            <w:r>
+              <w:t>:</w:t>
+            </w:r>
+          </w:p>
+        </w:tc>
+        <w:tc>
+          <w:tcPr>
+            <w:tcW w:w="0" w:type="auto"/>
+            <w:tcBorders>
+              <w:top w:val="single" w:sz="8" w:space="0" w:color="000000"/>
+              <w:left w:val="single" w:sz="8" w:space="0" w:color="000000"/>
+              <w:bottom w:val="single" w:sz="8" w:space="0" w:color="000000"/>
+              <w:right w:val="single" w:sz="8" w:space="0" w:color="000000"/>
+            </w:tcBorders>
+            <w:vAlign w:val="center"/>
+          </w:tcPr>
+          <w:p>
+            <w:pPr>
+              <w:jc w:val="both"/>
+              <w:rPr>
+                <w:sz w:val="24"/>
+                <w:szCs w:val="24"/>
+              </w:rPr>
+            </w:pPr>
+            <w:r>
+              <w:rPr>
+                <w:sz w:val="24"/>
+                <w:szCs w:val="24"/>
+              </w:rPr>
+              <w:t xml:space="preserve">{{Tender Percentage}}</w:t>
+            </w:r>
+          </w:p>
+        </w:tc>
+      </w:tr>
+      <w:tr>
+        <w:trPr>
+          <w:cantSplit/>
+          <w:trHeight w:val="812"/>
+          <w:tblCellSpacing w:w="0" w:type="dxa"/>
+          <w:jc w:val="center"/>
+        </w:trPr>
+        <w:tc>
+          <w:tcPr>
+            <w:tcW w:w="3344" w:type="dxa"/>
+            <w:tcBorders>
+              <w:top w:val="single" w:sz="8" w:space="0" w:color="000000"/>
+              <w:left w:val="single" w:sz="8" w:space="0" w:color="000000"/>
+              <w:bottom w:val="single" w:sz="8" w:space="0" w:color="000000"/>
+              <w:right w:val="single" w:sz="8" w:space="0" w:color="000000"/>
+            </w:tcBorders>
+            <w:vAlign w:val="center"/>
+          </w:tcPr>
+          <w:p>
+            <w:pPr>
+              <w:jc w:val="center"/>
+              <w:rPr>
+                <w:sz w:val="24"/>
+                <w:szCs w:val="24"/>
+              </w:rPr>
+            </w:pPr>
+            <w:r>
+              <w:rPr>
+                <w:b/>
+                <w:sz w:val="24"/>
+                <w:szCs w:val="24"/>
+              </w:rPr>
+              <w:t>Name of the Agency</w:t>
+            </w:r>
+          </w:p>
+        </w:tc>
+        <w:tc>
+          <w:tcPr>
+            <w:tcW w:w="469" w:type="dxa"/>
+            <w:tcBorders>
+              <w:top w:val="single" w:sz="8" w:space="0" w:color="000000"/>
+              <w:left w:val="single" w:sz="8" w:space="0" w:color="000000"/>
+              <w:bottom w:val="single" w:sz="8" w:space="0" w:color="000000"/>
+              <w:right w:val="single" w:sz="8" w:space="0" w:color="000000"/>
+            </w:tcBorders>
+            <w:vAlign w:val="center"/>
+          </w:tcPr>
+          <w:p>
+            <w:pPr>
+              <w:jc w:val="center"/>
+            </w:pPr>
+            <w:r>
+              <w:t>:</w:t>
+            </w:r>
+          </w:p>
+        </w:tc>
+        <w:tc>
+          <w:tcPr>
+            <w:tcW w:w="0" w:type="auto"/>
+            <w:tcBorders>
+              <w:top w:val="single" w:sz="8" w:space="0" w:color="000000"/>
+              <w:left w:val="single" w:sz="8" w:space="0" w:color="000000"/>
+              <w:bottom w:val="single" w:sz="8" w:space="0" w:color="000000"/>
+              <w:right w:val="single" w:sz="8" w:space="0" w:color="000000"/>
+            </w:tcBorders>
+            <w:vAlign w:val="center"/>
+          </w:tcPr>
+          <w:p>
+            <w:pPr>
+              <w:jc w:val="both"/>
+              <w:rPr>
+                <w:sz w:val="24"/>
+                <w:szCs w:val="24"/>
+              </w:rPr>
+            </w:pPr>
+            <w:r>
+              <w:rPr>
+                <w:sz w:val="24"/>
+                <w:szCs w:val="24"/>
+              </w:rPr>
+              <w:t xml:space="preserve">{{Name of the agency}}</w:t>
+            </w:r>
+          </w:p>
+        </w:tc>
+      </w:tr>
+      <w:tr>
+        <w:trPr>
+          <w:cantSplit/>
+          <w:trHeight w:val="812"/>
+          <w:tblCellSpacing w:w="0" w:type="dxa"/>
+          <w:jc w:val="center"/>
+        </w:trPr>
+        <w:tc>
+          <w:tcPr>
+            <w:tcW w:w="3344" w:type="dxa"/>
+            <w:tcBorders>
+              <w:top w:val="single" w:sz="8" w:space="0" w:color="000000"/>
+              <w:left w:val="single" w:sz="8" w:space="0" w:color="000000"/>
+              <w:bottom w:val="single" w:sz="8" w:space="0" w:color="000000"/>
+              <w:right w:val="single" w:sz="8" w:space="0" w:color="000000"/>
+            </w:tcBorders>
+            <w:vAlign w:val="center"/>
+          </w:tcPr>
+          <w:p>
+            <w:pPr>
+              <w:jc w:val="center"/>
+              <w:rPr>
+                <w:sz w:val="24"/>
+                <w:szCs w:val="24"/>
+              </w:rPr>
+            </w:pPr>
+            <w:r>
+              <w:rPr>
+                <w:b/>
+                <w:sz w:val="24"/>
+                <w:szCs w:val="24"/>
+              </w:rPr>
+              <w:t>Address of the Agency</w:t>
+            </w:r>
+          </w:p>
+        </w:tc>
+        <w:tc>
+          <w:tcPr>
+            <w:tcW w:w="469" w:type="dxa"/>
+            <w:tcBorders>
+              <w:top w:val="single" w:sz="8" w:space="0" w:color="000000"/>
+              <w:left w:val="single" w:sz="8" w:space="0" w:color="000000"/>
+              <w:bottom w:val="single" w:sz="8" w:space="0" w:color="000000"/>
+              <w:right w:val="single" w:sz="8" w:space="0" w:color="000000"/>
+            </w:tcBorders>
+            <w:vAlign w:val="center"/>
+          </w:tcPr>
+          <w:p>
+            <w:pPr>
+              <w:jc w:val="center"/>
+            </w:pPr>
+            <w:r>
+              <w:t>:</w:t>
+            </w:r>
+          </w:p>
+        </w:tc>
+        <w:tc>
+          <w:tcPr>
+            <w:tcW w:w="0" w:type="auto"/>
+            <w:tcBorders>
+              <w:top w:val="single" w:sz="8" w:space="0" w:color="000000"/>
+              <w:left w:val="single" w:sz="8" w:space="0" w:color="000000"/>
+              <w:bottom w:val="single" w:sz="8" w:space="0" w:color="000000"/>
+              <w:right w:val="single" w:sz="8" w:space="0" w:color="000000"/>
+            </w:tcBorders>
+            <w:vAlign w:val="center"/>
+          </w:tcPr>
+          <w:p>
+            <w:pPr>
+              <w:jc w:val="both"/>
+              <w:rPr>
+                <w:sz w:val="24"/>
+                <w:szCs w:val="24"/>
+              </w:rPr>
+            </w:pPr>
+            <w:r>
+              <w:rPr>
+                <w:sz w:val="24"/>
+                <w:szCs w:val="24"/>
+              </w:rPr>
+              <w:t xml:space="preserve">{{Address of the agency}}</w:t>
+            </w:r>
+          </w:p>
+        </w:tc>
+      </w:tr>
+    </w:tbl>
+    <w:p/>
+    <w:p>
+      <w:pPr>
+        <w:jc w:val="right"/>
+      </w:pPr>
+    </w:p>
+    <w:sectPr>
+      <w:pgSz w:w="12240" w:h="15840"/>
+      <w:pgMar w:top="1440" w:right="1800" w:bottom="1440" w:left="1800" w:header="720" w:footer="720" w:gutter="0"/>
+      <w:cols w:space="720"/>
+    </w:sectPr>
+  </w:body>
+</w:document>
 </file>
 
 <file path=word/styles.xml><?xml version="1.0" encoding="utf-8"?>

</xml_diff>

<commit_message>
Release 1.38.0 — Technical Sanction SoR+Data Sheet RAG, letterhead wrap/lean fix, Work Order Ref table, NIT item-no parsing
Co-Authored-By: Claude Sonnet 5 <noreply@anthropic.com>
</commit_message>
<xml_diff>
--- a/resources/file-backer-template-header2.docx
+++ b/resources/file-backer-template-header2.docx
@@ -128,6 +128,8 @@
             <w:r>
               <w:rPr>
                 <w:rFonts w:cs="Gautami"/>
+                <w:b/>
+                <w:bCs/>
                 <w:color w:val="009EC6"/>
                 <w:sz w:val="48"/>
                 <w:szCs w:val="44"/>
@@ -251,8 +253,7 @@
         <w:tblLook w:val="04A0" w:firstRow="1" w:lastRow="0" w:firstColumn="1" w:lastColumn="0" w:noHBand="0" w:noVBand="1"/>
       </w:tblPr>
       <w:tblGrid>
-        <w:gridCol w:w="3344"/>
-        <w:gridCol w:w="469"/>
+        <w:gridCol w:w="3813"/>
         <w:gridCol w:w="5817"/>
       </w:tblGrid>
       <w:tr>
@@ -264,7 +265,7 @@
         </w:trPr>
         <w:tc>
           <w:tcPr>
-            <w:tcW w:w="3344" w:type="dxa"/>
+            <w:tcW w:w="3813" w:type="dxa"/>
             <w:tcBorders>
               <w:top w:val="single" w:sz="8" w:space="0" w:color="000000"/>
               <w:left w:val="single" w:sz="8" w:space="0" w:color="000000"/>
@@ -288,26 +289,6 @@
                 <w:szCs w:val="24"/>
               </w:rPr>
               <w:t>Tender ID</w:t>
-            </w:r>
-          </w:p>
-        </w:tc>
-        <w:tc>
-          <w:tcPr>
-            <w:tcW w:w="469" w:type="dxa"/>
-            <w:tcBorders>
-              <w:top w:val="single" w:sz="8" w:space="0" w:color="000000"/>
-              <w:left w:val="single" w:sz="8" w:space="0" w:color="000000"/>
-              <w:bottom w:val="single" w:sz="8" w:space="0" w:color="000000"/>
-              <w:right w:val="single" w:sz="8" w:space="0" w:color="000000"/>
-            </w:tcBorders>
-            <w:vAlign w:val="center"/>
-          </w:tcPr>
-          <w:p>
-            <w:pPr>
-              <w:jc w:val="center"/>
-            </w:pPr>
-            <w:r>
-              <w:t>:</w:t>
             </w:r>
           </w:p>
         </w:tc>
@@ -349,7 +330,7 @@
         </w:trPr>
         <w:tc>
           <w:tcPr>
-            <w:tcW w:w="3344" w:type="dxa"/>
+            <w:tcW w:w="3813" w:type="dxa"/>
             <w:tcBorders>
               <w:top w:val="single" w:sz="8" w:space="0" w:color="000000"/>
               <w:left w:val="single" w:sz="8" w:space="0" w:color="000000"/>
@@ -373,26 +354,6 @@
                 <w:szCs w:val="24"/>
               </w:rPr>
               <w:t>NIT No &amp; Date</w:t>
-            </w:r>
-          </w:p>
-        </w:tc>
-        <w:tc>
-          <w:tcPr>
-            <w:tcW w:w="469" w:type="dxa"/>
-            <w:tcBorders>
-              <w:top w:val="single" w:sz="8" w:space="0" w:color="000000"/>
-              <w:left w:val="single" w:sz="8" w:space="0" w:color="000000"/>
-              <w:bottom w:val="single" w:sz="8" w:space="0" w:color="000000"/>
-              <w:right w:val="single" w:sz="8" w:space="0" w:color="000000"/>
-            </w:tcBorders>
-            <w:vAlign w:val="center"/>
-          </w:tcPr>
-          <w:p>
-            <w:pPr>
-              <w:jc w:val="center"/>
-            </w:pPr>
-            <w:r>
-              <w:t>:</w:t>
             </w:r>
           </w:p>
         </w:tc>
@@ -434,7 +395,7 @@
         </w:trPr>
         <w:tc>
           <w:tcPr>
-            <w:tcW w:w="3344" w:type="dxa"/>
+            <w:tcW w:w="3813" w:type="dxa"/>
             <w:tcBorders>
               <w:top w:val="single" w:sz="8" w:space="0" w:color="000000"/>
               <w:left w:val="single" w:sz="8" w:space="0" w:color="000000"/>
@@ -458,26 +419,6 @@
                 <w:szCs w:val="24"/>
               </w:rPr>
               <w:t>Name of the Work</w:t>
-            </w:r>
-          </w:p>
-        </w:tc>
-        <w:tc>
-          <w:tcPr>
-            <w:tcW w:w="469" w:type="dxa"/>
-            <w:tcBorders>
-              <w:top w:val="single" w:sz="8" w:space="0" w:color="000000"/>
-              <w:left w:val="single" w:sz="8" w:space="0" w:color="000000"/>
-              <w:bottom w:val="single" w:sz="8" w:space="0" w:color="000000"/>
-              <w:right w:val="single" w:sz="8" w:space="0" w:color="000000"/>
-            </w:tcBorders>
-            <w:vAlign w:val="center"/>
-          </w:tcPr>
-          <w:p>
-            <w:pPr>
-              <w:jc w:val="center"/>
-            </w:pPr>
-            <w:r>
-              <w:t>:</w:t>
             </w:r>
           </w:p>
         </w:tc>
@@ -519,7 +460,7 @@
         </w:trPr>
         <w:tc>
           <w:tcPr>
-            <w:tcW w:w="3344" w:type="dxa"/>
+            <w:tcW w:w="3813" w:type="dxa"/>
             <w:tcBorders>
               <w:top w:val="single" w:sz="8" w:space="0" w:color="000000"/>
               <w:left w:val="single" w:sz="8" w:space="0" w:color="000000"/>
@@ -543,26 +484,6 @@
                 <w:szCs w:val="24"/>
               </w:rPr>
               <w:t>Estimate Amount</w:t>
-            </w:r>
-          </w:p>
-        </w:tc>
-        <w:tc>
-          <w:tcPr>
-            <w:tcW w:w="469" w:type="dxa"/>
-            <w:tcBorders>
-              <w:top w:val="single" w:sz="8" w:space="0" w:color="000000"/>
-              <w:left w:val="single" w:sz="8" w:space="0" w:color="000000"/>
-              <w:bottom w:val="single" w:sz="8" w:space="0" w:color="000000"/>
-              <w:right w:val="single" w:sz="8" w:space="0" w:color="000000"/>
-            </w:tcBorders>
-            <w:vAlign w:val="center"/>
-          </w:tcPr>
-          <w:p>
-            <w:pPr>
-              <w:jc w:val="center"/>
-            </w:pPr>
-            <w:r>
-              <w:t>:</w:t>
             </w:r>
           </w:p>
         </w:tc>
@@ -604,7 +525,7 @@
         </w:trPr>
         <w:tc>
           <w:tcPr>
-            <w:tcW w:w="3344" w:type="dxa"/>
+            <w:tcW w:w="3813" w:type="dxa"/>
             <w:tcBorders>
               <w:top w:val="single" w:sz="8" w:space="0" w:color="000000"/>
               <w:left w:val="single" w:sz="8" w:space="0" w:color="000000"/>
@@ -628,26 +549,6 @@
                 <w:szCs w:val="24"/>
               </w:rPr>
               <w:t>ECV</w:t>
-            </w:r>
-          </w:p>
-        </w:tc>
-        <w:tc>
-          <w:tcPr>
-            <w:tcW w:w="469" w:type="dxa"/>
-            <w:tcBorders>
-              <w:top w:val="single" w:sz="8" w:space="0" w:color="000000"/>
-              <w:left w:val="single" w:sz="8" w:space="0" w:color="000000"/>
-              <w:bottom w:val="single" w:sz="8" w:space="0" w:color="000000"/>
-              <w:right w:val="single" w:sz="8" w:space="0" w:color="000000"/>
-            </w:tcBorders>
-            <w:vAlign w:val="center"/>
-          </w:tcPr>
-          <w:p>
-            <w:pPr>
-              <w:jc w:val="center"/>
-            </w:pPr>
-            <w:r>
-              <w:t>:</w:t>
             </w:r>
           </w:p>
         </w:tc>
@@ -689,7 +590,7 @@
         </w:trPr>
         <w:tc>
           <w:tcPr>
-            <w:tcW w:w="3344" w:type="dxa"/>
+            <w:tcW w:w="3813" w:type="dxa"/>
             <w:tcBorders>
               <w:top w:val="single" w:sz="8" w:space="0" w:color="000000"/>
               <w:left w:val="single" w:sz="8" w:space="0" w:color="000000"/>
@@ -713,26 +614,6 @@
                 <w:szCs w:val="24"/>
               </w:rPr>
               <w:t>Contract Amount</w:t>
-            </w:r>
-          </w:p>
-        </w:tc>
-        <w:tc>
-          <w:tcPr>
-            <w:tcW w:w="469" w:type="dxa"/>
-            <w:tcBorders>
-              <w:top w:val="single" w:sz="8" w:space="0" w:color="000000"/>
-              <w:left w:val="single" w:sz="8" w:space="0" w:color="000000"/>
-              <w:bottom w:val="single" w:sz="8" w:space="0" w:color="000000"/>
-              <w:right w:val="single" w:sz="8" w:space="0" w:color="000000"/>
-            </w:tcBorders>
-            <w:vAlign w:val="center"/>
-          </w:tcPr>
-          <w:p>
-            <w:pPr>
-              <w:jc w:val="center"/>
-            </w:pPr>
-            <w:r>
-              <w:t>:</w:t>
             </w:r>
           </w:p>
         </w:tc>
@@ -774,7 +655,7 @@
         </w:trPr>
         <w:tc>
           <w:tcPr>
-            <w:tcW w:w="3344" w:type="dxa"/>
+            <w:tcW w:w="3813" w:type="dxa"/>
             <w:tcBorders>
               <w:top w:val="single" w:sz="8" w:space="0" w:color="000000"/>
               <w:left w:val="single" w:sz="8" w:space="0" w:color="000000"/>
@@ -798,26 +679,6 @@
                 <w:szCs w:val="24"/>
               </w:rPr>
               <w:t>Tender Percentage</w:t>
-            </w:r>
-          </w:p>
-        </w:tc>
-        <w:tc>
-          <w:tcPr>
-            <w:tcW w:w="469" w:type="dxa"/>
-            <w:tcBorders>
-              <w:top w:val="single" w:sz="8" w:space="0" w:color="000000"/>
-              <w:left w:val="single" w:sz="8" w:space="0" w:color="000000"/>
-              <w:bottom w:val="single" w:sz="8" w:space="0" w:color="000000"/>
-              <w:right w:val="single" w:sz="8" w:space="0" w:color="000000"/>
-            </w:tcBorders>
-            <w:vAlign w:val="center"/>
-          </w:tcPr>
-          <w:p>
-            <w:pPr>
-              <w:jc w:val="center"/>
-            </w:pPr>
-            <w:r>
-              <w:t>:</w:t>
             </w:r>
           </w:p>
         </w:tc>
@@ -859,7 +720,7 @@
         </w:trPr>
         <w:tc>
           <w:tcPr>
-            <w:tcW w:w="3344" w:type="dxa"/>
+            <w:tcW w:w="3813" w:type="dxa"/>
             <w:tcBorders>
               <w:top w:val="single" w:sz="8" w:space="0" w:color="000000"/>
               <w:left w:val="single" w:sz="8" w:space="0" w:color="000000"/>
@@ -883,26 +744,6 @@
                 <w:szCs w:val="24"/>
               </w:rPr>
               <w:t>Name of the Agency</w:t>
-            </w:r>
-          </w:p>
-        </w:tc>
-        <w:tc>
-          <w:tcPr>
-            <w:tcW w:w="469" w:type="dxa"/>
-            <w:tcBorders>
-              <w:top w:val="single" w:sz="8" w:space="0" w:color="000000"/>
-              <w:left w:val="single" w:sz="8" w:space="0" w:color="000000"/>
-              <w:bottom w:val="single" w:sz="8" w:space="0" w:color="000000"/>
-              <w:right w:val="single" w:sz="8" w:space="0" w:color="000000"/>
-            </w:tcBorders>
-            <w:vAlign w:val="center"/>
-          </w:tcPr>
-          <w:p>
-            <w:pPr>
-              <w:jc w:val="center"/>
-            </w:pPr>
-            <w:r>
-              <w:t>:</w:t>
             </w:r>
           </w:p>
         </w:tc>
@@ -944,7 +785,7 @@
         </w:trPr>
         <w:tc>
           <w:tcPr>
-            <w:tcW w:w="3344" w:type="dxa"/>
+            <w:tcW w:w="3813" w:type="dxa"/>
             <w:tcBorders>
               <w:top w:val="single" w:sz="8" w:space="0" w:color="000000"/>
               <w:left w:val="single" w:sz="8" w:space="0" w:color="000000"/>
@@ -968,26 +809,6 @@
                 <w:szCs w:val="24"/>
               </w:rPr>
               <w:t>Address of the Agency</w:t>
-            </w:r>
-          </w:p>
-        </w:tc>
-        <w:tc>
-          <w:tcPr>
-            <w:tcW w:w="469" w:type="dxa"/>
-            <w:tcBorders>
-              <w:top w:val="single" w:sz="8" w:space="0" w:color="000000"/>
-              <w:left w:val="single" w:sz="8" w:space="0" w:color="000000"/>
-              <w:bottom w:val="single" w:sz="8" w:space="0" w:color="000000"/>
-              <w:right w:val="single" w:sz="8" w:space="0" w:color="000000"/>
-            </w:tcBorders>
-            <w:vAlign w:val="center"/>
-          </w:tcPr>
-          <w:p>
-            <w:pPr>
-              <w:jc w:val="center"/>
-            </w:pPr>
-            <w:r>
-              <w:t>:</w:t>
             </w:r>
           </w:p>
         </w:tc>

</xml_diff>